<commit_message>
Strip em-dashes from all deliverables; add CLAUDE.md copy-style rule
- Removed em-dashes from all build scripts and regenerated every .docx/.xlsx (replaced with commas/periods/colons; en-dashes in numeric ranges kept)
- Added CLAUDE.md: never use em-dashes; no fabricated proof; build-script workflow notes
</commit_message>
<xml_diff>
--- a/Well-and-Good-Websites-Action-Plan-and-Copy-2026-06-28.docx
+++ b/Well-and-Good-Websites-Action-Plan-and-Copy-2026-06-28.docx
@@ -8,7 +8,7 @@
           <w:b/>
           <w:sz w:val="48"/>
         </w:rPr>
-        <w:t>Well and Good Websites — Action Plan &amp; Ready-to-Ship Copy</w:t>
+        <w:t>Well and Good Websites: Action Plan &amp; Ready-to-Ship Copy</w:t>
       </w:r>
     </w:p>
     <w:p>
@@ -17,7 +17,7 @@
           <w:i/>
           <w:color w:val="555555"/>
         </w:rPr>
-        <w:t>Built from your live-site audit + competitive teardown (Cedar+Mint, KMK, Cool Koala), 2026-06-28. Strategy in one line: you have the strongest offer and the weakest credibility — so this is mostly about making a strong offer believable, not repositioning.</w:t>
+        <w:t>Built from your live-site audit + competitive teardown (Cedar+Mint, KMK, Cool Koala), 2026-06-28. Strategy in one line: you have the strongest offer and the weakest credibility, so this is mostly about making a strong offer believable, not repositioning.</w:t>
       </w:r>
     </w:p>
     <w:p>
@@ -38,7 +38,7 @@
         <w:pStyle w:val="ListNumber"/>
       </w:pPr>
       <w:r>
-        <w:t>Relabel / move the github.io prototypes — they currently read as fake client work (live liability).</w:t>
+        <w:t>Relabel / move the github.io prototypes, they currently read as fake client work (live liability).</w:t>
       </w:r>
     </w:p>
     <w:p>
@@ -54,7 +54,7 @@
         <w:pStyle w:val="ListNumber"/>
       </w:pPr>
       <w:r>
-        <w:t>Add Frank's case study + approved testimonial — your one real, live client.</w:t>
+        <w:t>Add Frank's case study + approved testimonial, your one real, live client.</w:t>
       </w:r>
     </w:p>
     <w:p>
@@ -62,7 +62,7 @@
         <w:pStyle w:val="ListNumber"/>
       </w:pPr>
       <w:r>
-        <w:t>Launch the guarantee — open ground none of your four competitors hold.</w:t>
+        <w:t>Launch the guarantee, open ground none of your four competitors hold.</w:t>
       </w:r>
     </w:p>
     <w:p>
@@ -70,7 +70,7 @@
         <w:pStyle w:val="ListNumber"/>
       </w:pPr>
       <w:r>
-        <w:t>Fix GA4 / Hotjar — you're optimizing blind until this works.</w:t>
+        <w:t>Fix GA4 / Hotjar, you're optimizing blind until this works.</w:t>
       </w:r>
     </w:p>
     <w:p>
@@ -78,7 +78,7 @@
         <w:pStyle w:val="ListNumber"/>
       </w:pPr>
       <w:r>
-        <w:t>— credibility line — everything below only pays off once the above is true —</w:t>
+        <w:t xml:space="preserve">, credibility line, everything below only pays off once the above is true, </w:t>
       </w:r>
     </w:p>
     <w:p>
@@ -94,7 +94,7 @@
         <w:pStyle w:val="Heading1"/>
       </w:pPr>
       <w:r>
-        <w:t>Part 1 — Ready-to-ship copy</w:t>
+        <w:t>Part 1, Ready-to-ship copy</w:t>
       </w:r>
     </w:p>
     <w:p>
@@ -111,7 +111,7 @@
         <w:pStyle w:val="Heading2"/>
       </w:pPr>
       <w:r>
-        <w:t>Hero headline — 5 variants to test</w:t>
+        <w:t>Hero headline, 5 variants to test</w:t>
       </w:r>
     </w:p>
     <w:p>
@@ -125,7 +125,7 @@
     </w:p>
     <w:p>
       <w:r>
-        <w:t>A — Outcome + timeframe (recommended primary):</w:t>
+        <w:t>A, Outcome + timeframe (recommended primary):</w:t>
       </w:r>
     </w:p>
     <w:p>
@@ -136,12 +136,12 @@
         <w:rPr>
           <w:sz w:val="24"/>
         </w:rPr>
-        <w:t>Get found on Google and chosen by local customers — your site live in 24 hours.</w:t>
+        <w:t>Get found on Google and chosen by local customers, your site live in 24 hours.</w:t>
       </w:r>
     </w:p>
     <w:p>
       <w:r>
-        <w:t>B — Price contrast:</w:t>
+        <w:t>B, Price contrast:</w:t>
       </w:r>
     </w:p>
     <w:p>
@@ -157,7 +157,7 @@
     </w:p>
     <w:p>
       <w:r>
-        <w:t>C — Risk-reversal led (recommended challenger):</w:t>
+        <w:t>C, Risk-reversal led (recommended challenger):</w:t>
       </w:r>
     </w:p>
     <w:p>
@@ -173,7 +173,7 @@
     </w:p>
     <w:p>
       <w:r>
-        <w:t>D — Bundle:</w:t>
+        <w:t>D, Bundle:</w:t>
       </w:r>
     </w:p>
     <w:p>
@@ -184,12 +184,12 @@
         <w:rPr>
           <w:sz w:val="24"/>
         </w:rPr>
-        <w:t>Website, SEO, and social — for less than agencies charge for SEO alone. Live in 24 hours.</w:t>
+        <w:t>Website, SEO, and social, for less than agencies charge for SEO alone. Live in 24 hours.</w:t>
       </w:r>
     </w:p>
     <w:p>
       <w:r>
-        <w:t>E — Pain / enemy:</w:t>
+        <w:t>E, Pain / enemy:</w:t>
       </w:r>
     </w:p>
     <w:p>
@@ -209,7 +209,7 @@
           <w:i/>
           <w:color w:val="555555"/>
         </w:rPr>
-        <w:t>→ Test A vs C first (outcome vs risk-reversal). Keep the H2 confession line — it's already excellent: "Local agencies don't publish their pricing. We have nothing to hide."</w:t>
+        <w:t>→ Test A vs C first (outcome vs risk-reversal). Keep the H2 confession line, it's already excellent: "Local agencies don't publish their pricing. We have nothing to hide."</w:t>
       </w:r>
     </w:p>
     <w:p>
@@ -217,7 +217,7 @@
         <w:pStyle w:val="Heading2"/>
       </w:pPr>
       <w:r>
-        <w:t>Eyebrow / section line — replace the filler</w:t>
+        <w:t>Eyebrow / section line, replace the filler</w:t>
       </w:r>
     </w:p>
     <w:p>
@@ -233,7 +233,7 @@
         <w:rPr>
           <w:sz w:val="24"/>
         </w:rPr>
-        <w:t>Everything an agency sells separately — website, SEO, social, reviews — bundled into one monthly price.</w:t>
+        <w:t>Everything an agency sells separately, website, SEO, social, reviews, bundled into one monthly price.</w:t>
       </w:r>
     </w:p>
     <w:p>
@@ -257,7 +257,7 @@
         <w:rPr>
           <w:sz w:val="24"/>
         </w:rPr>
-        <w:t>Your site live in 24 hours — or your first month is free. Then I revise it until you're happy.</w:t>
+        <w:t>Your site live in 24 hours, or your first month is free. Then I revise it until you're happy.</w:t>
       </w:r>
     </w:p>
     <w:p>
@@ -274,7 +274,7 @@
         <w:pStyle w:val="Heading2"/>
       </w:pPr>
       <w:r>
-        <w:t>About Matt — founder block</w:t>
+        <w:t>About Matt, founder block</w:t>
       </w:r>
     </w:p>
     <w:p>
@@ -283,7 +283,7 @@
           <w:b/>
           <w:color w:val="B00000"/>
         </w:rPr>
-        <w:t>⚑ [INSERT HEADSHOT — the photo you sent. Place left of the text, ~150px round.]</w:t>
+        <w:t>⚑ [INSERT HEADSHOT, the photo you sent. Place left of the text, ~150px round.]</w:t>
       </w:r>
     </w:p>
     <w:p>
@@ -326,7 +326,7 @@
         <w:rPr>
           <w:sz w:val="24"/>
         </w:rPr>
-        <w:t>Here's what I kept noticing: the big budgets and the high-tech industries pull further ahead every month — because they're the only ones using this stuff. So I started Well and Good Websites to hand that same fire to the businesses on my own street.</w:t>
+        <w:t>Here's what I kept noticing: the big budgets and the high-tech industries pull further ahead every month, because they're the only ones using this stuff. So I started Well and Good Websites to hand that same fire to the businesses on my own street.</w:t>
       </w:r>
     </w:p>
     <w:p>
@@ -357,7 +357,7 @@
           <w:i/>
           <w:color w:val="555555"/>
         </w:rPr>
-        <w:t>→ Optional bolder pull-quote if it fits the brand: "My goal is simple — steal the fire from the gods and hand it to Main Street." Use sparingly; it's a strong line but check it matches your voice.</w:t>
+        <w:t>→ Optional bolder pull-quote if it fits the brand: "My goal is simple, steal the fire from the gods and hand it to Main Street." Use sparingly; it's a strong line but check it matches your voice.</w:t>
       </w:r>
     </w:p>
     <w:p>
@@ -365,7 +365,7 @@
         <w:pStyle w:val="Heading2"/>
       </w:pPr>
       <w:r>
-        <w:t>Founder proof bar (from Jetta Grove — honestly attributed)</w:t>
+        <w:t>Founder proof bar (from Jetta Grove, honestly attributed)</w:t>
       </w:r>
     </w:p>
     <w:p>
@@ -390,7 +390,7 @@
           <w:b/>
           <w:color w:val="B00000"/>
         </w:rPr>
-        <w:t>⚑ [ADD A SCREENSHOT or link to jettagrove.com next to this — it's what makes the numbers believable.]</w:t>
+        <w:t>⚑ [ADD A SCREENSHOT or link to jettagrove.com next to this, it's what makes the numbers believable.]</w:t>
       </w:r>
     </w:p>
     <w:p>
@@ -407,7 +407,7 @@
         <w:pStyle w:val="Heading2"/>
       </w:pPr>
       <w:r>
-        <w:t>Recent Work — honest relabel (most urgent fix)</w:t>
+        <w:t>Recent Work, honest relabel (most urgent fix)</w:t>
       </w:r>
     </w:p>
     <w:p>
@@ -416,7 +416,7 @@
           <w:b/>
           <w:color w:val="B00000"/>
         </w:rPr>
-        <w:t>⚑ Two of three items live on immeasurablematt.github.io and read as spec builds — which contradicts your "agency results" claim. Fix this first.</w:t>
+        <w:t>⚑ Two of three items live on immeasurablematt.github.io and read as spec builds, which contradicts your "agency results" claim. Fix this first.</w:t>
       </w:r>
     </w:p>
     <w:p>
@@ -424,7 +424,7 @@
         <w:pStyle w:val="Heading3"/>
       </w:pPr>
       <w:r>
-        <w:t>Item 1 — Frank Baggetta (REAL, feature first)</w:t>
+        <w:t>Item 1, Frank Baggetta (REAL, feature first)</w:t>
       </w:r>
     </w:p>
     <w:p>
@@ -452,7 +452,7 @@
         <w:pStyle w:val="Heading3"/>
       </w:pPr>
       <w:r>
-        <w:t>Items 2 &amp; 3 — Sandwich shop &amp; auto repair (PROTOTYPES)</w:t>
+        <w:t>Items 2 &amp; 3, Sandwich shop &amp; auto repair (PROTOTYPES)</w:t>
       </w:r>
     </w:p>
     <w:p>
@@ -473,7 +473,7 @@
         <w:pStyle w:val="ListBullet"/>
       </w:pPr>
       <w:r>
-        <w:t>Minimum: keep where they are but add a clear "Concept build — example, not a client" label.</w:t>
+        <w:t>Minimum: keep where they are but add a clear "Concept build, example, not a client" label.</w:t>
       </w:r>
     </w:p>
     <w:p>
@@ -489,7 +489,7 @@
         <w:rPr>
           <w:sz w:val="24"/>
         </w:rPr>
-        <w:t>Concept build — a sandwich shop in Welland. An example of what a one-page site looks like for a quick-service spot.</w:t>
+        <w:t>Concept build, a sandwich shop in Welland. An example of what a one-page site looks like for a quick-service spot.</w:t>
       </w:r>
     </w:p>
     <w:p>
@@ -500,7 +500,7 @@
         <w:rPr>
           <w:sz w:val="24"/>
         </w:rPr>
-        <w:t>Concept build — an auto shop in Welland. An example of a call-first layout built around real Google reviews.</w:t>
+        <w:t>Concept build, an auto shop in Welland. An example of a call-first layout built around real Google reviews.</w:t>
       </w:r>
     </w:p>
     <w:p>
@@ -517,7 +517,7 @@
         <w:pStyle w:val="Heading2"/>
       </w:pPr>
       <w:r>
-        <w:t>Frank's testimonial — DRAFT for his approval</w:t>
+        <w:t>Frank's testimonial, DRAFT for his approval</w:t>
       </w:r>
     </w:p>
     <w:p>
@@ -526,7 +526,7 @@
           <w:b/>
           <w:color w:val="B00000"/>
         </w:rPr>
-        <w:t>⚑ [SEND TO FRANK TO APPROVE OR EDIT. Do not publish until he signs off. Swap in a specific result if he has one — more inquiries, found on Google for his name, etc.]</w:t>
+        <w:t>⚑ [SEND TO FRANK TO APPROVE OR EDIT. Do not publish until he signs off. Swap in a specific result if he has one, more inquiries, found on Google for his name, etc.]</w:t>
       </w:r>
     </w:p>
     <w:p>
@@ -537,7 +537,7 @@
         <w:rPr>
           <w:sz w:val="24"/>
         </w:rPr>
-        <w:t>"I'm not a tech person, and I'd put off a proper website for too long. Matt had mine live faster than I thought was possible, and now it actually looks the part when someone Googles me. I sent him what I had and he handled the rest — painless." — Frank Baggetta, FrankBaggetta.ca</w:t>
+        <w:t>"I'm not a tech person, and I'd put off a proper website for too long. Matt had mine live faster than I thought was possible, and now it actually looks the part when someone Googles me. I sent him what I had and he handled the rest, painless.", Frank Baggetta, FrankBaggetta.ca</w:t>
       </w:r>
     </w:p>
     <w:p>
@@ -546,7 +546,7 @@
           <w:i/>
           <w:color w:val="555555"/>
         </w:rPr>
-        <w:t>→ I kept this experiential and metric-free on purpose — I won't invent numbers for Frank. If he can give one real outcome, it gets far stronger (the teardown's point: proof-with-numbers wins ties vs. Cool Koala).</w:t>
+        <w:t>→ I kept this experiential and metric-free on purpose, I won't invent numbers for Frank. If he can give one real outcome, it gets far stronger (the teardown's point: proof-with-numbers wins ties vs. Cool Koala).</w:t>
       </w:r>
     </w:p>
     <w:p>
@@ -570,7 +570,7 @@
         <w:rPr>
           <w:sz w:val="24"/>
         </w:rPr>
-        <w:t>H1: Get found on Google and chosen by local customers — your site live in 24 hours.</w:t>
+        <w:t>H1: Get found on Google and chosen by local customers, your site live in 24 hours.</w:t>
       </w:r>
     </w:p>
     <w:p>
@@ -589,7 +589,7 @@
         <w:pStyle w:val="Heading1"/>
       </w:pPr>
       <w:r>
-        <w:t>Part 2 — Implementation checklist</w:t>
+        <w:t>Part 2, Implementation checklist</w:t>
       </w:r>
     </w:p>
     <w:p>
@@ -597,7 +597,7 @@
         <w:pStyle w:val="Heading2"/>
       </w:pPr>
       <w:r>
-        <w:t>This week (credibility — do in order)</w:t>
+        <w:t>This week (credibility, do in order)</w:t>
       </w:r>
     </w:p>
     <w:p>
@@ -669,7 +669,7 @@
         <w:pStyle w:val="ListBullet"/>
       </w:pPr>
       <w:r>
-        <w:t>Turn Frank — and any prototype that closes — into a numbers case study (situation → build → result + screenshot).</w:t>
+        <w:t>Turn Frank, and any prototype that closes, into a numbers case study (situation → build → result + screenshot).</w:t>
       </w:r>
     </w:p>
     <w:p>
@@ -733,7 +733,7 @@
         <w:pStyle w:val="Heading1"/>
       </w:pPr>
       <w:r>
-        <w:t>Part 3 — Still open</w:t>
+        <w:t>Part 3, Still open</w:t>
       </w:r>
     </w:p>
     <w:p>
@@ -774,7 +774,7 @@
           <w:i/>
           <w:color w:val="555555"/>
         </w:rPr>
-        <w:t>→ Everything here is honest and defensible as written. The only true 'proof' assets right now are Frank (real) and your Jetta Grove track record (yours) — so those carry the credibility load until reviews and closed prototypes come in. That's exactly the bottleneck the teardown identified; this plan buys credibility the fastest honest way.</w:t>
+        <w:t>→ Everything here is honest and defensible as written. The only true 'proof' assets right now are Frank (real) and your Jetta Grove track record (yours), so those carry the credibility load until reviews and closed prototypes come in. That's exactly the bottleneck the teardown identified; this plan buys credibility the fastest honest way.</w:t>
       </w:r>
     </w:p>
     <w:sectPr>

</xml_diff>